<commit_message>
changed first page of report
</commit_message>
<xml_diff>
--- a/Lab_1/Combined_Labs_1_and_2_Report.docx
+++ b/Lab_1/Combined_Labs_1_and_2_Report.docx
@@ -26,12 +26,12 @@
           <wp:inline distB="0" distT="0" distL="0" distR="0">
             <wp:extent cx="1292863" cy="704364"/>
             <wp:effectExtent b="0" l="0" r="0" t="0"/>
-            <wp:docPr id="17" name="image4.png"/>
+            <wp:docPr id="17" name="image18.png"/>
             <a:graphic>
               <a:graphicData uri="http://schemas.openxmlformats.org/drawingml/2006/picture">
                 <pic:pic>
                   <pic:nvPicPr>
-                    <pic:cNvPr id="0" name="image4.png"/>
+                    <pic:cNvPr id="0" name="image18.png"/>
                     <pic:cNvPicPr preferRelativeResize="0"/>
                   </pic:nvPicPr>
                   <pic:blipFill>
@@ -456,17 +456,20 @@
         <w:jc w:val="right"/>
         <w:rPr>
           <w:rFonts w:ascii="Times New Roman" w:cs="Times New Roman" w:eastAsia="Times New Roman" w:hAnsi="Times New Roman"/>
-          <w:i w:val="1"/>
-          <w:iCs w:val="1"/>
           <w:sz w:val="28"/>
           <w:szCs w:val="28"/>
-          <w:highlight w:val="yellow"/>
-        </w:rPr>
-      </w:pPr>
-      <w:r>
-        <w:rPr>
-          <w:rtl w:val="0"/>
-        </w:rPr>
+        </w:rPr>
+      </w:pPr>
+      <w:r>
+        <w:rPr>
+          <w:rFonts w:ascii="Times New Roman" w:cs="Times New Roman" w:eastAsia="Times New Roman" w:hAnsi="Times New Roman"/>
+          <w:sz w:val="28"/>
+          <w:szCs w:val="28"/>
+          <w:rtl w:val="0"/>
+        </w:rPr>
+        <w:t xml:space="preserve">Verified by:</w:t>
+        <w:br w:type="textWrapping"/>
+        <w:t xml:space="preserve">Reițman Patricia</w:t>
       </w:r>
     </w:p>
     <w:p>
@@ -491,26 +494,8 @@
     </w:p>
     <w:p>
       <w:pPr>
-        <w:spacing w:line="360" w:lineRule="auto"/>
-        <w:rPr>
-          <w:rFonts w:ascii="Times New Roman" w:cs="Times New Roman" w:eastAsia="Times New Roman" w:hAnsi="Times New Roman"/>
-          <w:i w:val="1"/>
-          <w:iCs w:val="1"/>
-          <w:sz w:val="28"/>
-          <w:szCs w:val="28"/>
-          <w:highlight w:val="yellow"/>
-        </w:rPr>
-      </w:pPr>
-      <w:r>
-        <w:rPr>
-          <w:rtl w:val="0"/>
-        </w:rPr>
-      </w:r>
-    </w:p>
-    <w:p>
-      <w:pPr>
         <w:spacing w:after="40" w:lineRule="auto"/>
-        <w:jc w:val="center"/>
+        <w:jc w:val="left"/>
         <w:rPr>
           <w:rFonts w:ascii="Times New Roman" w:cs="Times New Roman" w:eastAsia="Times New Roman" w:hAnsi="Times New Roman"/>
           <w:b w:val="1"/>
@@ -548,28 +533,21 @@
         <w:spacing w:after="40" w:lineRule="auto"/>
         <w:jc w:val="center"/>
         <w:rPr>
+          <w:sz w:val="20"/>
+          <w:szCs w:val="20"/>
+        </w:rPr>
+      </w:pPr>
+      <w:r>
+        <w:rPr>
           <w:rFonts w:ascii="Times New Roman" w:cs="Times New Roman" w:eastAsia="Times New Roman" w:hAnsi="Times New Roman"/>
           <w:b w:val="1"/>
           <w:bCs w:val="1"/>
           <w:sz w:val="28"/>
           <w:szCs w:val="28"/>
-        </w:rPr>
-      </w:pPr>
-      <w:r>
-        <w:rPr>
-          <w:rtl w:val="0"/>
-        </w:rPr>
-      </w:r>
-    </w:p>
-    <w:p>
-      <w:pPr>
-        <w:spacing w:after="40" w:lineRule="auto"/>
-        <w:jc w:val="center"/>
-        <w:rPr>
-          <w:sz w:val="20"/>
-          <w:szCs w:val="20"/>
-        </w:rPr>
-      </w:pPr>
+          <w:rtl w:val="0"/>
+        </w:rPr>
+        <w:t xml:space="preserve">Chisinau</w:t>
+      </w:r>
       <w:r>
         <w:rPr>
           <w:rFonts w:ascii="Times New Roman" w:cs="Times New Roman" w:eastAsia="Times New Roman" w:hAnsi="Times New Roman"/>
@@ -579,17 +557,6 @@
           <w:szCs w:val="28"/>
           <w:rtl w:val="0"/>
         </w:rPr>
-        <w:t xml:space="preserve">Chisinau</w:t>
-      </w:r>
-      <w:r>
-        <w:rPr>
-          <w:rFonts w:ascii="Times New Roman" w:cs="Times New Roman" w:eastAsia="Times New Roman" w:hAnsi="Times New Roman"/>
-          <w:b w:val="1"/>
-          <w:bCs w:val="1"/>
-          <w:sz w:val="28"/>
-          <w:szCs w:val="28"/>
-          <w:rtl w:val="0"/>
-        </w:rPr>
         <w:t xml:space="preserve"> – 2026</w:t>
       </w:r>
       <w:r>
@@ -603,7 +570,7 @@
     </w:p>
     <w:sdt>
       <w:sdtPr>
-        <w:id w:val="1782342970"/>
+        <w:id w:val="-996857557"/>
         <w:docPartObj>
           <w:docPartGallery w:val="Table of Contents"/>
           <w:docPartUnique w:val="1"/>
@@ -1164,8 +1131,10 @@
       </w:r>
       <w:r>
         <w:rPr>
-          <w:rtl w:val="0"/>
-        </w:rPr>
+          <w:color w:val="000000"/>
+          <w:rtl w:val="0"/>
+        </w:rPr>
+        <w:t xml:space="preserve"> </w:t>
       </w:r>
     </w:p>
     <w:p>
@@ -1186,25 +1155,6 @@
           <w:rtl w:val="0"/>
         </w:rPr>
         <w:t xml:space="preserve">Lab 1 Report: The OS as a Resource Manager</w:t>
-      </w:r>
-      <w:r>
-        <w:rPr>
-          <w:rtl w:val="0"/>
-        </w:rPr>
-      </w:r>
-    </w:p>
-    <w:p>
-      <w:pPr>
-        <w:spacing w:after="120" w:lineRule="auto"/>
-        <w:rPr/>
-      </w:pPr>
-      <w:r>
-        <w:rPr>
-          <w:sz w:val="24"/>
-          <w:szCs w:val="24"/>
-          <w:rtl w:val="0"/>
-        </w:rPr>
-        <w:t xml:space="preserve">Track A: the real OS, from the outside (Linux)</w:t>
       </w:r>
       <w:r>
         <w:rPr>
@@ -1654,12 +1604,12 @@
           <wp:inline distB="0" distT="0" distL="0" distR="0">
             <wp:extent cx="4953000" cy="2266950"/>
             <wp:effectExtent b="0" l="0" r="0" t="0"/>
-            <wp:docPr descr="terminal screenshot 19_26_23" id="1" name="image7.png"/>
+            <wp:docPr descr="terminal screenshot 19_26_23" id="1" name="image5.png"/>
             <a:graphic>
               <a:graphicData uri="http://schemas.openxmlformats.org/drawingml/2006/picture">
                 <pic:pic>
                   <pic:nvPicPr>
-                    <pic:cNvPr descr="terminal screenshot 19_26_23" id="0" name="image7.png"/>
+                    <pic:cNvPr descr="terminal screenshot 19_26_23" id="0" name="image5.png"/>
                     <pic:cNvPicPr preferRelativeResize="0"/>
                   </pic:nvPicPr>
                   <pic:blipFill>
@@ -1703,7 +1653,7 @@
           <w:szCs w:val="18"/>
           <w:rtl w:val="0"/>
         </w:rPr>
-        <w:t xml:space="preserve">Figure 0. whoami, uname -a, uptime</w:t>
+        <w:t xml:space="preserve">Figure 1. whoami, uname -a, uptime</w:t>
       </w:r>
       <w:r>
         <w:rPr>
@@ -2566,12 +2516,12 @@
           <wp:inline distB="0" distT="0" distL="0" distR="0">
             <wp:extent cx="4572000" cy="2733675"/>
             <wp:effectExtent b="0" l="0" r="0" t="0"/>
-            <wp:docPr descr="terminal screenshot 19_39_55" id="3" name="image18.png"/>
+            <wp:docPr descr="terminal screenshot 19_39_55" id="3" name="image16.png"/>
             <a:graphic>
               <a:graphicData uri="http://schemas.openxmlformats.org/drawingml/2006/picture">
                 <pic:pic>
                   <pic:nvPicPr>
-                    <pic:cNvPr descr="terminal screenshot 19_39_55" id="0" name="image18.png"/>
+                    <pic:cNvPr descr="terminal screenshot 19_39_55" id="0" name="image16.png"/>
                     <pic:cNvPicPr preferRelativeResize="0"/>
                   </pic:nvPicPr>
                   <pic:blipFill>
@@ -2635,12 +2585,12 @@
           <wp:inline distB="0" distT="0" distL="0" distR="0">
             <wp:extent cx="4572000" cy="1933575"/>
             <wp:effectExtent b="0" l="0" r="0" t="0"/>
-            <wp:docPr descr="terminal screenshot 19_42_00" id="2" name="image10.png"/>
+            <wp:docPr descr="terminal screenshot 19_42_00" id="2" name="image14.png"/>
             <a:graphic>
               <a:graphicData uri="http://schemas.openxmlformats.org/drawingml/2006/picture">
                 <pic:pic>
                   <pic:nvPicPr>
-                    <pic:cNvPr descr="terminal screenshot 19_42_00" id="0" name="image10.png"/>
+                    <pic:cNvPr descr="terminal screenshot 19_42_00" id="0" name="image14.png"/>
                     <pic:cNvPicPr preferRelativeResize="0"/>
                   </pic:nvPicPr>
                   <pic:blipFill>
@@ -2704,12 +2654,12 @@
           <wp:inline distB="0" distT="0" distL="0" distR="0">
             <wp:extent cx="4572000" cy="1000125"/>
             <wp:effectExtent b="0" l="0" r="0" t="0"/>
-            <wp:docPr descr="terminal screenshot 19_44_15" id="5" name="image8.png"/>
+            <wp:docPr descr="terminal screenshot 19_44_15" id="5" name="image17.png"/>
             <a:graphic>
               <a:graphicData uri="http://schemas.openxmlformats.org/drawingml/2006/picture">
                 <pic:pic>
                   <pic:nvPicPr>
-                    <pic:cNvPr descr="terminal screenshot 19_44_15" id="0" name="image8.png"/>
+                    <pic:cNvPr descr="terminal screenshot 19_44_15" id="0" name="image17.png"/>
                     <pic:cNvPicPr preferRelativeResize="0"/>
                   </pic:nvPicPr>
                   <pic:blipFill>
@@ -4068,12 +4018,12 @@
           <wp:inline distB="0" distT="0" distL="0" distR="0">
             <wp:extent cx="4762500" cy="2447925"/>
             <wp:effectExtent b="0" l="0" r="0" t="0"/>
-            <wp:docPr descr="terminal screenshot 19_48_22" id="4" name="image13.png"/>
+            <wp:docPr descr="terminal screenshot 19_48_22" id="4" name="image1.png"/>
             <a:graphic>
               <a:graphicData uri="http://schemas.openxmlformats.org/drawingml/2006/picture">
                 <pic:pic>
                   <pic:nvPicPr>
-                    <pic:cNvPr descr="terminal screenshot 19_48_22" id="0" name="image13.png"/>
+                    <pic:cNvPr descr="terminal screenshot 19_48_22" id="0" name="image1.png"/>
                     <pic:cNvPicPr preferRelativeResize="0"/>
                   </pic:nvPicPr>
                   <pic:blipFill>
@@ -4137,12 +4087,12 @@
           <wp:inline distB="0" distT="0" distL="0" distR="0">
             <wp:extent cx="4381500" cy="2352675"/>
             <wp:effectExtent b="0" l="0" r="0" t="0"/>
-            <wp:docPr descr="terminal screenshot 19_51_53" id="7" name="image12.png"/>
+            <wp:docPr descr="terminal screenshot 19_51_53" id="7" name="image13.png"/>
             <a:graphic>
               <a:graphicData uri="http://schemas.openxmlformats.org/drawingml/2006/picture">
                 <pic:pic>
                   <pic:nvPicPr>
-                    <pic:cNvPr descr="terminal screenshot 19_51_53" id="0" name="image12.png"/>
+                    <pic:cNvPr descr="terminal screenshot 19_51_53" id="0" name="image13.png"/>
                     <pic:cNvPicPr preferRelativeResize="0"/>
                   </pic:nvPicPr>
                   <pic:blipFill>
@@ -4196,22 +4146,14 @@
     </w:p>
     <w:p>
       <w:pPr>
-        <w:spacing w:after="120" w:lineRule="auto"/>
-        <w:rPr/>
-      </w:pPr>
-      <w:r>
-        <w:rPr>
-          <w:b w:val="1"/>
-          <w:bCs w:val="1"/>
-          <w:rtl w:val="0"/>
-        </w:rPr>
-        <w:t xml:space="preserve">Note: </w:t>
-      </w:r>
-      <w:r>
-        <w:rPr>
-          <w:rtl w:val="0"/>
-        </w:rPr>
-        <w:t xml:space="preserve">my first kill attempts failed. kill &lt;PID&gt; is a syntax error because &lt;PID&gt; is a placeholder, not a real number, and kill $PID failed because the variable PID was not set yet. The lesson is that the real number printed by the shell has to be used. In the next step I stored the PID with PID=$! and kill $PID worked (the shell reported "Terminated").</w:t>
+        <w:spacing w:after="160" w:lineRule="auto"/>
+        <w:jc w:val="left"/>
+        <w:rPr/>
+      </w:pPr>
+      <w:r>
+        <w:rPr>
+          <w:rtl w:val="0"/>
+        </w:rPr>
       </w:r>
     </w:p>
     <w:p>
@@ -4226,12 +4168,12 @@
           <wp:inline distB="0" distT="0" distL="0" distR="0">
             <wp:extent cx="3810000" cy="2943225"/>
             <wp:effectExtent b="0" l="0" r="0" t="0"/>
-            <wp:docPr descr="terminal screenshot 19_56_00" id="6" name="image14.png"/>
+            <wp:docPr descr="terminal screenshot 19_56_00" id="6" name="image3.png"/>
             <a:graphic>
               <a:graphicData uri="http://schemas.openxmlformats.org/drawingml/2006/picture">
                 <pic:pic>
                   <pic:nvPicPr>
-                    <pic:cNvPr descr="terminal screenshot 19_56_00" id="0" name="image14.png"/>
+                    <pic:cNvPr descr="terminal screenshot 19_56_00" id="0" name="image3.png"/>
                     <pic:cNvPicPr preferRelativeResize="0"/>
                   </pic:nvPicPr>
                   <pic:blipFill>
@@ -4984,12 +4926,12 @@
           <wp:inline distB="0" distT="0" distL="0" distR="0">
             <wp:extent cx="4572000" cy="2085975"/>
             <wp:effectExtent b="0" l="0" r="0" t="0"/>
-            <wp:docPr descr="terminal screenshot 19_57_59" id="9" name="image5.png"/>
+            <wp:docPr descr="terminal screenshot 19_57_59" id="9" name="image11.png"/>
             <a:graphic>
               <a:graphicData uri="http://schemas.openxmlformats.org/drawingml/2006/picture">
                 <pic:pic>
                   <pic:nvPicPr>
-                    <pic:cNvPr descr="terminal screenshot 19_57_59" id="0" name="image5.png"/>
+                    <pic:cNvPr descr="terminal screenshot 19_57_59" id="0" name="image11.png"/>
                     <pic:cNvPicPr preferRelativeResize="0"/>
                   </pic:nvPicPr>
                   <pic:blipFill>
@@ -5848,12 +5790,12 @@
           <wp:inline distB="0" distT="0" distL="0" distR="0">
             <wp:extent cx="4572000" cy="3209925"/>
             <wp:effectExtent b="0" l="0" r="0" t="0"/>
-            <wp:docPr descr="terminal screenshot 20_01_31" id="8" name="image16.png"/>
+            <wp:docPr descr="terminal screenshot 20_01_31" id="8" name="image12.png"/>
             <a:graphic>
               <a:graphicData uri="http://schemas.openxmlformats.org/drawingml/2006/picture">
                 <pic:pic>
                   <pic:nvPicPr>
-                    <pic:cNvPr descr="terminal screenshot 20_01_31" id="0" name="image16.png"/>
+                    <pic:cNvPr descr="terminal screenshot 20_01_31" id="0" name="image12.png"/>
                     <pic:cNvPicPr preferRelativeResize="0"/>
                   </pic:nvPicPr>
                   <pic:blipFill>
@@ -7027,12 +6969,12 @@
           <wp:inline distB="0" distT="0" distL="0" distR="0">
             <wp:extent cx="4572000" cy="428625"/>
             <wp:effectExtent b="0" l="0" r="0" t="0"/>
-            <wp:docPr descr="terminal screenshot 20_18_57" id="12" name="image1.png"/>
+            <wp:docPr descr="terminal screenshot 20_18_57" id="12" name="image4.png"/>
             <a:graphic>
               <a:graphicData uri="http://schemas.openxmlformats.org/drawingml/2006/picture">
                 <pic:pic>
                   <pic:nvPicPr>
-                    <pic:cNvPr descr="terminal screenshot 20_18_57" id="0" name="image1.png"/>
+                    <pic:cNvPr descr="terminal screenshot 20_18_57" id="0" name="image4.png"/>
                     <pic:cNvPicPr preferRelativeResize="0"/>
                   </pic:nvPicPr>
                   <pic:blipFill>
@@ -7754,12 +7696,12 @@
           <wp:inline distB="0" distT="0" distL="0" distR="0">
             <wp:extent cx="4572000" cy="1933575"/>
             <wp:effectExtent b="0" l="0" r="0" t="0"/>
-            <wp:docPr descr="terminal screenshot 20_23_46" id="10" name="image6.png"/>
+            <wp:docPr descr="terminal screenshot 20_23_46" id="10" name="image8.png"/>
             <a:graphic>
               <a:graphicData uri="http://schemas.openxmlformats.org/drawingml/2006/picture">
                 <pic:pic>
                   <pic:nvPicPr>
-                    <pic:cNvPr descr="terminal screenshot 20_23_46" id="0" name="image6.png"/>
+                    <pic:cNvPr descr="terminal screenshot 20_23_46" id="0" name="image8.png"/>
                     <pic:cNvPicPr preferRelativeResize="0"/>
                   </pic:nvPicPr>
                   <pic:blipFill>
@@ -8352,12 +8294,12 @@
           <wp:inline distB="0" distT="0" distL="0" distR="0">
             <wp:extent cx="3810000" cy="3314700"/>
             <wp:effectExtent b="0" l="0" r="0" t="0"/>
-            <wp:docPr descr="terminal screenshot 20_28_50" id="11" name="image11.png"/>
+            <wp:docPr descr="terminal screenshot 20_28_50" id="11" name="image6.png"/>
             <a:graphic>
               <a:graphicData uri="http://schemas.openxmlformats.org/drawingml/2006/picture">
                 <pic:pic>
                   <pic:nvPicPr>
-                    <pic:cNvPr descr="terminal screenshot 20_28_50" id="0" name="image11.png"/>
+                    <pic:cNvPr descr="terminal screenshot 20_28_50" id="0" name="image6.png"/>
                     <pic:cNvPicPr preferRelativeResize="0"/>
                   </pic:nvPicPr>
                   <pic:blipFill>
@@ -8421,12 +8363,12 @@
           <wp:inline distB="0" distT="0" distL="0" distR="0">
             <wp:extent cx="4572000" cy="1524000"/>
             <wp:effectExtent b="0" l="0" r="0" t="0"/>
-            <wp:docPr descr="terminal screenshot 20_29_00" id="13" name="image17.png"/>
+            <wp:docPr descr="terminal screenshot 20_29_00" id="13" name="image15.png"/>
             <a:graphic>
               <a:graphicData uri="http://schemas.openxmlformats.org/drawingml/2006/picture">
                 <pic:pic>
                   <pic:nvPicPr>
-                    <pic:cNvPr descr="terminal screenshot 20_29_00" id="0" name="image17.png"/>
+                    <pic:cNvPr descr="terminal screenshot 20_29_00" id="0" name="image15.png"/>
                     <pic:cNvPicPr preferRelativeResize="0"/>
                   </pic:nvPicPr>
                   <pic:blipFill>
@@ -9386,12 +9328,12 @@
           <wp:inline distB="0" distT="0" distL="0" distR="0">
             <wp:extent cx="3810000" cy="2962275"/>
             <wp:effectExtent b="0" l="0" r="0" t="0"/>
-            <wp:docPr descr="terminal screenshot 20_32_15" id="14" name="image9.png"/>
+            <wp:docPr descr="terminal screenshot 20_32_15" id="14" name="image2.png"/>
             <a:graphic>
               <a:graphicData uri="http://schemas.openxmlformats.org/drawingml/2006/picture">
                 <pic:pic>
                   <pic:nvPicPr>
-                    <pic:cNvPr descr="terminal screenshot 20_32_15" id="0" name="image9.png"/>
+                    <pic:cNvPr descr="terminal screenshot 20_32_15" id="0" name="image2.png"/>
                     <pic:cNvPicPr preferRelativeResize="0"/>
                   </pic:nvPicPr>
                   <pic:blipFill>
@@ -9455,12 +9397,12 @@
           <wp:inline distB="0" distT="0" distL="0" distR="0">
             <wp:extent cx="4572000" cy="657225"/>
             <wp:effectExtent b="0" l="0" r="0" t="0"/>
-            <wp:docPr descr="terminal screenshot 20_32_40" id="15" name="image15.png"/>
+            <wp:docPr descr="terminal screenshot 20_32_40" id="15" name="image10.png"/>
             <a:graphic>
               <a:graphicData uri="http://schemas.openxmlformats.org/drawingml/2006/picture">
                 <pic:pic>
                   <pic:nvPicPr>
-                    <pic:cNvPr descr="terminal screenshot 20_32_40" id="0" name="image15.png"/>
+                    <pic:cNvPr descr="terminal screenshot 20_32_40" id="0" name="image10.png"/>
                     <pic:cNvPicPr preferRelativeResize="0"/>
                   </pic:nvPicPr>
                   <pic:blipFill>
@@ -10831,12 +10773,12 @@
           <wp:inline distB="0" distT="0" distL="0" distR="0">
             <wp:extent cx="4191000" cy="952500"/>
             <wp:effectExtent b="0" l="0" r="0" t="0"/>
-            <wp:docPr descr="terminal screenshot 20_43_04" id="16" name="image3.png"/>
+            <wp:docPr descr="terminal screenshot 20_43_04" id="16" name="image9.png"/>
             <a:graphic>
               <a:graphicData uri="http://schemas.openxmlformats.org/drawingml/2006/picture">
                 <pic:pic>
                   <pic:nvPicPr>
-                    <pic:cNvPr descr="terminal screenshot 20_43_04" id="0" name="image3.png"/>
+                    <pic:cNvPr descr="terminal screenshot 20_43_04" id="0" name="image9.png"/>
                     <pic:cNvPicPr preferRelativeResize="0"/>
                   </pic:nvPicPr>
                   <pic:blipFill>
@@ -10900,12 +10842,12 @@
           <wp:inline distB="0" distT="0" distL="0" distR="0">
             <wp:extent cx="2857500" cy="781050"/>
             <wp:effectExtent b="0" l="0" r="0" t="0"/>
-            <wp:docPr descr="terminal screenshot 20_47_26" id="18" name="image2.png"/>
+            <wp:docPr descr="terminal screenshot 20_47_26" id="18" name="image7.png"/>
             <a:graphic>
               <a:graphicData uri="http://schemas.openxmlformats.org/drawingml/2006/picture">
                 <pic:pic>
                   <pic:nvPicPr>
-                    <pic:cNvPr descr="terminal screenshot 20_47_26" id="0" name="image2.png"/>
+                    <pic:cNvPr descr="terminal screenshot 20_47_26" id="0" name="image7.png"/>
                     <pic:cNvPicPr preferRelativeResize="0"/>
                   </pic:nvPicPr>
                   <pic:blipFill>

</xml_diff>